<commit_message>
Fix клич -> іклач terminology in Ukrainian summary documents (docs_ua)
</commit_message>
<xml_diff>
--- a/docs_ua/03-observer-manual.docx
+++ b/docs_ua/03-observer-manual.docx
@@ -586,7 +586,7 @@
                 <w:sz w:val="20"/>
                 <w:szCs w:val="20"/>
               </w:rPr>
-              <w:t xml:space="preserve">Мічення клича та скатів</w:t>
+              <w:t xml:space="preserve">Мічення іклача та скатів</w:t>
             </w:r>
           </w:p>
         </w:tc>
@@ -796,7 +796,7 @@
                 <w:sz w:val="20"/>
                 <w:szCs w:val="20"/>
               </w:rPr>
-              <w:t xml:space="preserve">Протокол мічення клича та скатів</w:t>
+              <w:t xml:space="preserve">Протокол мічення іклача та скатів</w:t>
             </w:r>
           </w:p>
         </w:tc>
@@ -958,7 +958,7 @@
           <w:sz w:val="22"/>
           <w:szCs w:val="22"/>
         </w:rPr>
-        <w:t xml:space="preserve">Короткий вступ до програми мічення клича та скатів; повна процедура — в окремому документі «Toothfish and Skate Tagging Manual» (розділ 8 сайту).</w:t>
+        <w:t xml:space="preserve">Короткий вступ до програми мічення іклача та скатів; повна процедура — в окремому документі «Toothfish and Skate Tagging Manual» (розділ 8 сайту).</w:t>
       </w:r>
     </w:p>
     <w:p>

</xml_diff>